<commit_message>
add commit for labs 01-04
</commit_message>
<xml_diff>
--- a/TP-KB-232-Demydenko-Oleksandr_RGR.docx
+++ b/TP-KB-232-Demydenko-Oleksandr_RGR.docx
@@ -528,13 +528,10 @@
         </w:rPr>
       </w:pPr>
     </w:p>
-    <w:p>
-      <w:pPr>
-        <w:rPr>
-          <w:lang w:val="uk-UA"/>
-        </w:rPr>
-      </w:pPr>
-    </w:p>
+    <w:p/>
+    <w:p/>
+    <w:p/>
+    <w:p/>
     <w:p>
       <w:pPr>
         <w:jc w:val="center"/>
@@ -548,25 +545,6 @@
         </w:rPr>
         <w:t>2024</w:t>
       </w:r>
-    </w:p>
-    <w:p>
-      <w:pPr>
-        <w:rPr>
-          <w:lang w:val="ru-RU"/>
-        </w:rPr>
-      </w:pPr>
-    </w:p>
-    <w:p>
-      <w:pPr>
-        <w:spacing w:after="200" w:line="276" w:lineRule="auto"/>
-        <w:ind w:firstLine="0"/>
-        <w:jc w:val="center"/>
-        <w:rPr>
-          <w:b/>
-          <w:szCs w:val="28"/>
-          <w:lang w:val="ru-RU"/>
-        </w:rPr>
-      </w:pPr>
       <w:r>
         <w:rPr>
           <w:szCs w:val="28"/>

</xml_diff>